<commit_message>
modified:   screens/certificate_screen.py 	modified:   temp_certificate.docx 	new file:   templets/semester - Temp - En - D - SBS.docx 	modified:   templets/semester - Temp - En - D.docx
</commit_message>
<xml_diff>
--- a/templets/semester - Temp - En - D.docx
+++ b/templets/semester - Temp - En - D.docx
@@ -430,13 +430,8 @@
                 <w:lang w:bidi="ar-IQ"/>
               </w:rPr>
             </w:pPr>
-            <w:proofErr w:type="gramStart"/>
             <w:r>
-              <w:t>Semester:{</w:t>
-            </w:r>
-            <w:proofErr w:type="gramEnd"/>
-            <w:r>
-              <w:t>{</w:t>
+              <w:t>Semester:{{</w:t>
             </w:r>
             <w:proofErr w:type="spellStart"/>
             <w:r>
@@ -465,13 +460,8 @@
                 <w:lang w:bidi="ar-IQ"/>
               </w:rPr>
             </w:pPr>
-            <w:proofErr w:type="gramStart"/>
             <w:r>
-              <w:t>Average:{</w:t>
-            </w:r>
-            <w:proofErr w:type="gramEnd"/>
-            <w:r>
-              <w:t>{average}}</w:t>
+              <w:t>Average:{{average}}</w:t>
             </w:r>
           </w:p>
         </w:tc>
@@ -498,28 +488,66 @@
       </w:tr>
       <w:tr>
         <w:trPr>
-          <w:trHeight w:val="477"/>
+          <w:trHeight w:val="340"/>
+        </w:trPr>
+        <w:tc>
+          <w:tcPr>
+            <w:tcW w:w="5000" w:type="pct"/>
+            <w:gridSpan w:val="4"/>
+            <w:vAlign w:val="center"/>
+          </w:tcPr>
+          <w:p>
+            <w:pPr>
+              <w:bidi w:val="0"/>
+              <w:spacing w:after="0" w:line="240" w:lineRule="auto"/>
+            </w:pPr>
+            <w:r>
+              <w:t>{% if sequence_ON %}</w:t>
+            </w:r>
+          </w:p>
+        </w:tc>
+      </w:tr>
+      <w:tr>
+        <w:trPr>
+          <w:trHeight w:val="340"/>
         </w:trPr>
         <w:tc>
           <w:tcPr>
             <w:tcW w:w="1680" w:type="pct"/>
+            <w:vAlign w:val="center"/>
           </w:tcPr>
           <w:p>
-            <w:r/>
+            <w:pPr>
+              <w:bidi w:val="0"/>
+              <w:spacing w:after="0"/>
+            </w:pPr>
+            <w:proofErr w:type="spellStart"/>
             <w:r>
-              <w:rPr/>
-              <w:t>{% if sequence_ON %}Sequence_of_Graduation: {{Sequence_of_Graduation}}{% endif %}</w:t>
+              <w:t>Sequence_of_Graduation</w:t>
+            </w:r>
+            <w:proofErr w:type="spellEnd"/>
+            <w:r>
+              <w:t>: {{</w:t>
+            </w:r>
+            <w:proofErr w:type="spellStart"/>
+            <w:r>
+              <w:t>Sequence_of_Graduation</w:t>
+            </w:r>
+            <w:proofErr w:type="spellEnd"/>
+            <w:r>
+              <w:t>}}</w:t>
             </w:r>
           </w:p>
         </w:tc>
         <w:tc>
           <w:tcPr>
             <w:tcW w:w="1615" w:type="pct"/>
+            <w:vAlign w:val="center"/>
           </w:tcPr>
           <w:p>
             <w:pPr>
               <w:bidi w:val="0"/>
-              <w:spacing w:line="240" w:lineRule="auto"/>
+              <w:spacing w:after="0" w:line="240" w:lineRule="auto"/>
               <w:rPr>
                 <w:rFonts w:cs="PT Bold Heading"/>
                 <w:sz w:val="20"/>
@@ -544,12 +572,36 @@
           <w:tcPr>
             <w:tcW w:w="1705" w:type="pct"/>
             <w:gridSpan w:val="2"/>
+            <w:vAlign w:val="center"/>
           </w:tcPr>
           <w:p>
-            <w:r/>
+            <w:pPr>
+              <w:bidi w:val="0"/>
+              <w:spacing w:after="0"/>
+            </w:pPr>
             <w:r>
-              <w:rPr/>
               <w:t>Average_of_First_Student: {{Average_of_First_Student}}</w:t>
+            </w:r>
+          </w:p>
+        </w:tc>
+      </w:tr>
+      <w:tr>
+        <w:trPr>
+          <w:trHeight w:val="340"/>
+        </w:trPr>
+        <w:tc>
+          <w:tcPr>
+            <w:tcW w:w="5000" w:type="pct"/>
+            <w:gridSpan w:val="4"/>
+            <w:vAlign w:val="center"/>
+          </w:tcPr>
+          <w:p>
+            <w:pPr>
+              <w:bidi w:val="0"/>
+              <w:spacing w:after="0"/>
+            </w:pPr>
+            <w:r>
+              <w:t>{% endif %}</w:t>
             </w:r>
           </w:p>
         </w:tc>
@@ -558,7 +610,7 @@
     <w:p>
       <w:pPr>
         <w:bidi w:val="0"/>
-        <w:spacing w:line="240" w:lineRule="auto"/>
+        <w:spacing w:after="0" w:line="240" w:lineRule="auto"/>
         <w:rPr>
           <w:rFonts w:cs="PT Bold Heading"/>
           <w:sz w:val="20"/>
@@ -573,7 +625,7 @@
     <w:p>
       <w:pPr>
         <w:bidi w:val="0"/>
-        <w:spacing w:line="240" w:lineRule="auto"/>
+        <w:spacing w:after="0" w:line="240" w:lineRule="auto"/>
         <w:rPr>
           <w:rFonts w:cs="PT Bold Heading"/>
           <w:sz w:val="20"/>
@@ -581,11 +633,9 @@
           <w:lang w:bidi="ar-IQ"/>
         </w:rPr>
       </w:pPr>
-      <w:proofErr w:type="spellStart"/>
-      <w:r>
-        <w:t>Bellow</w:t>
-      </w:r>
-      <w:proofErr w:type="spellEnd"/>
+      <w:r>
+        <w:t>Below</w:t>
+      </w:r>
       <w:r>
         <w:t xml:space="preserve"> is the official transcript of the subjects and marks achieved during the years of study. </w:t>
       </w:r>
@@ -596,15 +646,7 @@
         <w:spacing w:line="240" w:lineRule="auto"/>
       </w:pPr>
       <w:r>
-        <w:t xml:space="preserve">{% for period in </w:t>
-      </w:r>
-      <w:proofErr w:type="spellStart"/>
-      <w:r>
-        <w:t>academic_periods</w:t>
-      </w:r>
-      <w:proofErr w:type="spellEnd"/>
-      <w:r>
-        <w:t xml:space="preserve"> %}</w:t>
+        <w:t>{% for period in academic_periods %}</w:t>
       </w:r>
     </w:p>
     <w:tbl>
@@ -629,21 +671,8 @@
               <w:bidi w:val="0"/>
               <w:spacing w:after="0"/>
             </w:pPr>
-            <w:proofErr w:type="gramStart"/>
             <w:r>
-              <w:t xml:space="preserve">{{ </w:t>
-            </w:r>
-            <w:proofErr w:type="spellStart"/>
-            <w:r>
-              <w:t>period</w:t>
-            </w:r>
-            <w:proofErr w:type="gramEnd"/>
-            <w:r>
-              <w:t>.title</w:t>
-            </w:r>
-            <w:proofErr w:type="spellEnd"/>
-            <w:r>
-              <w:t xml:space="preserve"> }}</w:t>
+              <w:t>{{period.title }}</w:t>
             </w:r>
           </w:p>
         </w:tc>
@@ -695,6 +724,23 @@
       <w:tr>
         <w:tc>
           <w:tcPr>
+            <w:tcW w:w="5000" w:type="pct"/>
+            <w:gridSpan w:val="3"/>
+          </w:tcPr>
+          <w:p>
+            <w:pPr>
+              <w:bidi w:val="0"/>
+              <w:spacing w:after="0"/>
+            </w:pPr>
+            <w:r>
+              <w:t>{%tr for row in period.rows %}</w:t>
+            </w:r>
+          </w:p>
+        </w:tc>
+      </w:tr>
+      <w:tr>
+        <w:tc>
+          <w:tcPr>
             <w:tcW w:w="1762" w:type="pct"/>
           </w:tcPr>
           <w:p>
@@ -703,33 +749,7 @@
               <w:spacing w:after="0"/>
             </w:pPr>
             <w:r>
-              <w:t xml:space="preserve">{%tr for row in </w:t>
-            </w:r>
-            <w:proofErr w:type="spellStart"/>
-            <w:proofErr w:type="gramStart"/>
-            <w:r>
-              <w:t>period.rows</w:t>
-            </w:r>
-            <w:proofErr w:type="spellEnd"/>
-            <w:proofErr w:type="gramEnd"/>
-            <w:r>
-              <w:t xml:space="preserve"> %}</w:t>
-            </w:r>
-            <w:r>
-              <w:t xml:space="preserve"> </w:t>
-            </w:r>
-            <w:r>
-              <w:t>{{</w:t>
-            </w:r>
-            <w:proofErr w:type="spellStart"/>
-            <w:proofErr w:type="gramStart"/>
-            <w:r>
-              <w:t>row.subject</w:t>
-            </w:r>
-            <w:proofErr w:type="spellEnd"/>
-            <w:proofErr w:type="gramEnd"/>
-            <w:r>
-              <w:t>}}</w:t>
+              <w:t>{{row.subject}}</w:t>
             </w:r>
           </w:p>
         </w:tc>
@@ -743,17 +763,7 @@
               <w:spacing w:after="0"/>
             </w:pPr>
             <w:r>
-              <w:t>{{</w:t>
-            </w:r>
-            <w:proofErr w:type="spellStart"/>
-            <w:proofErr w:type="gramStart"/>
-            <w:r>
-              <w:t>row.mark</w:t>
-            </w:r>
-            <w:proofErr w:type="spellEnd"/>
-            <w:proofErr w:type="gramEnd"/>
-            <w:r>
-              <w:t>}}</w:t>
+              <w:t>{{row.mark}}</w:t>
             </w:r>
           </w:p>
         </w:tc>
@@ -767,28 +777,24 @@
               <w:spacing w:after="0"/>
             </w:pPr>
             <w:r>
-              <w:t>{{</w:t>
+              <w:t>{{row.unit}}</w:t>
             </w:r>
-            <w:proofErr w:type="spellStart"/>
-            <w:proofErr w:type="gramStart"/>
+          </w:p>
+        </w:tc>
+      </w:tr>
+      <w:tr>
+        <w:tc>
+          <w:tcPr>
+            <w:tcW w:w="5000" w:type="pct"/>
+            <w:gridSpan w:val="3"/>
+          </w:tcPr>
+          <w:p>
+            <w:pPr>
+              <w:bidi w:val="0"/>
+              <w:spacing w:after="0"/>
+            </w:pPr>
             <w:r>
-              <w:t>row.unit</w:t>
-            </w:r>
-            <w:proofErr w:type="spellEnd"/>
-            <w:r>
-              <w:t>}}{</w:t>
-            </w:r>
-            <w:proofErr w:type="gramEnd"/>
-            <w:r>
-              <w:t xml:space="preserve">%tr </w:t>
-            </w:r>
-            <w:proofErr w:type="spellStart"/>
-            <w:r>
-              <w:t>endfor</w:t>
-            </w:r>
-            <w:proofErr w:type="spellEnd"/>
-            <w:r>
-              <w:t xml:space="preserve"> %}</w:t>
+              <w:t>{%tr endfor %}</w:t>
             </w:r>
           </w:p>
         </w:tc>
@@ -806,15 +812,7 @@
         <w:spacing w:line="240" w:lineRule="auto"/>
       </w:pPr>
       <w:r>
-        <w:t xml:space="preserve">{% </w:t>
-      </w:r>
-      <w:proofErr w:type="spellStart"/>
-      <w:r>
-        <w:t>endfor</w:t>
-      </w:r>
-      <w:proofErr w:type="spellEnd"/>
-      <w:r>
-        <w:t xml:space="preserve"> %}</w:t>
+        <w:t>{% endfor %}</w:t>
       </w:r>
     </w:p>
     <w:p>
@@ -1305,7 +1303,7 @@
       </w:r>
       <w:proofErr w:type="spellEnd"/>
       <w:r>
-        <w:t>}} (EX: 2/13/18515) in {{</w:t>
+        <w:t>}} in {{</w:t>
       </w:r>
       <w:proofErr w:type="spellStart"/>
       <w:r>
@@ -1313,7 +1311,7 @@
       </w:r>
       <w:proofErr w:type="spellEnd"/>
       <w:r>
-        <w:t>}} (EX: 7/8/2018)</w:t>
+        <w:t>}}</w:t>
       </w:r>
     </w:p>
     <w:p>
@@ -1464,35 +1462,19 @@
       </w:pPr>
       <w:proofErr w:type="spellStart"/>
       <w:r>
-        <w:t>Postponement_and_Failure_</w:t>
-      </w:r>
-      <w:proofErr w:type="gramStart"/>
-      <w:r>
-        <w:t>Years</w:t>
+        <w:t>Postponement_and_Failure_Years</w:t>
       </w:r>
       <w:proofErr w:type="spellEnd"/>
       <w:r>
-        <w:t xml:space="preserve"> :</w:t>
-      </w:r>
-      <w:proofErr w:type="gramEnd"/>
-      <w:r>
-        <w:t xml:space="preserve"> {{</w:t>
+        <w:t xml:space="preserve"> : {{</w:t>
       </w:r>
       <w:proofErr w:type="spellStart"/>
       <w:r>
-        <w:t>Postponement_and_Failure_</w:t>
-      </w:r>
-      <w:proofErr w:type="gramStart"/>
-      <w:r>
-        <w:t>Years</w:t>
+        <w:t>Postponement_and_Failure_Years</w:t>
       </w:r>
       <w:proofErr w:type="spellEnd"/>
       <w:r>
-        <w:t xml:space="preserve"> }</w:t>
-      </w:r>
-      <w:proofErr w:type="gramEnd"/>
-      <w:r>
-        <w:t>}.</w:t>
+        <w:t xml:space="preserve"> }}.</w:t>
       </w:r>
     </w:p>
     <w:p>
@@ -1535,15 +1517,13 @@
         <w:t xml:space="preserve"> if </w:t>
       </w:r>
       <w:proofErr w:type="spellStart"/>
-      <w:proofErr w:type="gramStart"/>
-      <w:r>
-        <w:t>Passed</w:t>
-      </w:r>
-      <w:proofErr w:type="gramEnd"/>
-      <w:r>
-        <w:t>_ON</w:t>
+      <w:r>
+        <w:t>Passed_ON</w:t>
       </w:r>
       <w:proofErr w:type="spellEnd"/>
+      <w:r>
+        <w:t xml:space="preserve"> </w:t>
+      </w:r>
       <w:r>
         <w:t>%}</w:t>
       </w:r>
@@ -1564,19 +1544,11 @@
       </w:pPr>
       <w:proofErr w:type="spellStart"/>
       <w:r>
-        <w:t>Subjects_Passed_with_Second_</w:t>
-      </w:r>
-      <w:proofErr w:type="gramStart"/>
-      <w:r>
-        <w:t>Trial</w:t>
+        <w:t>Subjects_Passed_with_Second_Trial</w:t>
       </w:r>
       <w:proofErr w:type="spellEnd"/>
       <w:r>
-        <w:t xml:space="preserve"> :</w:t>
-      </w:r>
-      <w:proofErr w:type="gramEnd"/>
-      <w:r>
-        <w:t xml:space="preserve"> {{</w:t>
+        <w:t xml:space="preserve"> : {{</w:t>
       </w:r>
       <w:proofErr w:type="spellStart"/>
       <w:r>
@@ -1605,6 +1577,9 @@
       </w:r>
       <w:r>
         <w:t>endif</w:t>
+      </w:r>
+      <w:r>
+        <w:t xml:space="preserve"> </w:t>
       </w:r>
       <w:r>
         <w:t>%}</w:t>
@@ -1625,23 +1600,7 @@
         </w:rPr>
       </w:pPr>
       <w:r>
-        <w:t xml:space="preserve">The Medium </w:t>
-      </w:r>
-      <w:proofErr w:type="gramStart"/>
-      <w:r>
-        <w:t>Of</w:t>
-      </w:r>
-      <w:proofErr w:type="gramEnd"/>
-      <w:r>
-        <w:t xml:space="preserve"> Instruction During </w:t>
-      </w:r>
-      <w:proofErr w:type="gramStart"/>
-      <w:r>
-        <w:t>The</w:t>
-      </w:r>
-      <w:proofErr w:type="gramEnd"/>
-      <w:r>
-        <w:t xml:space="preserve"> Entire Was English.</w:t>
+        <w:t>The Medium Of Instruction During The Entire Was English.</w:t>
       </w:r>
     </w:p>
     <w:p>
@@ -1660,15 +1619,7 @@
         </w:rPr>
       </w:pPr>
       <w:r>
-        <w:t xml:space="preserve">The Certificate is Free </w:t>
-      </w:r>
-      <w:proofErr w:type="gramStart"/>
-      <w:r>
-        <w:t>From</w:t>
-      </w:r>
-      <w:proofErr w:type="gramEnd"/>
-      <w:r>
-        <w:t xml:space="preserve"> Scratches and Corrections.</w:t>
+        <w:t>The Certificate is Free From Scratches and Corrections.</w:t>
       </w:r>
     </w:p>
     <w:p>
@@ -1908,7 +1859,7 @@
       <w:rPr>
         <w:noProof/>
       </w:rPr>
-      <w:pict w14:anchorId="40E608AF">
+      <w:pict w14:anchorId="4DB68A4E">
         <v:shapetype id="_x0000_t75" coordsize="21600,21600" o:spt="75" o:preferrelative="t" path="m@4@5l@4@11@9@11@9@5xe" filled="f" stroked="f">
           <v:stroke joinstyle="miter"/>
           <v:formulas>
@@ -2068,7 +2019,7 @@
       <w:rPr>
         <w:noProof/>
       </w:rPr>
-      <w:pict w14:anchorId="53E7FB1D">
+      <w:pict w14:anchorId="6EE4B6E3">
         <v:shapetype id="_x0000_t75" coordsize="21600,21600" o:spt="75" o:preferrelative="t" path="m@4@5l@4@11@9@11@9@5xe" filled="f" stroked="f">
           <v:stroke joinstyle="miter"/>
           <v:formulas>
@@ -5412,6 +5363,7 @@
   <w:style w:type="character" w:default="1" w:styleId="DefaultParagraphFont">
     <w:name w:val="Default Paragraph Font"/>
     <w:uiPriority w:val="1"/>
+    <w:semiHidden/>
     <w:unhideWhenUsed/>
   </w:style>
   <w:style w:type="table" w:default="1" w:styleId="TableNormal">

</xml_diff>